<commit_message>
Reorganización E1, E2, E6 parcial; terminología: «validación del diseño en operación experimental controlada» [IA: Claude]
Co-Authored-By: Claude Opus 5.5 <noreply@anthropic.com>
</commit_message>
<xml_diff>
--- a/11_Planificacion/Plan_Tesis_Torvesa_v0.1.docx
+++ b/11_Planificacion/Plan_Tesis_Torvesa_v0.1.docx
@@ -934,13 +934,13 @@
       </w:r>
       <w:r>
         <w:rPr/>
-        <w:t xml:space="preserve"> el trabajo de campo de S1, las revisiones 1 y 2 con la tutora, la medición post del piloto y el hito del 90 %. </w:t>
+        <w:t xml:space="preserve"> el trabajo de campo de S1, las revisiones 1 y 2 con la tutora, la medición post del validación del diseño en operación experimental controlada y el hito del 90 %. </w:t>
       </w:r>
       <w:r>
         <w:rPr>
           <w:b/>
         </w:rPr>
-        <w:t>Piloto:</w:t>
+        <w:t>Validación del diseño en operación experimental controlada:</w:t>
       </w:r>
       <w:r>
         <w:rPr/>
@@ -6397,7 +6397,7 @@
         <w:pStyle w:val="Heading2"/>
       </w:pPr>
       <w:r>
-        <w:t>S7 · 23–29 nov · Feedback + arranque del piloto</w:t>
+        <w:t>S7 · 23–29 nov · Feedback + arranque de la validación del diseño en operación experimental controlada</w:t>
       </w:r>
     </w:p>
     <w:tbl>
@@ -6722,7 +6722,7 @@
               <w:rPr>
                 <w:sz w:val="19"/>
               </w:rPr>
-              <w:t>Preparar la validación controlada (protocolo, capacitación, permisos)</w:t>
+              <w:t>Preparar la validación del diseño en operación experimental controlada (protocolo, capacitación, permisos)</w:t>
             </w:r>
           </w:p>
         </w:tc>
@@ -6766,7 +6766,7 @@
               <w:rPr>
                 <w:sz w:val="19"/>
               </w:rPr>
-              <w:t>protocolo del piloto</w:t>
+              <w:t>protocolo de la validación del diseño en operación experimental controlada</w:t>
             </w:r>
           </w:p>
         </w:tc>
@@ -6854,7 +6854,7 @@
               <w:rPr>
                 <w:sz w:val="19"/>
               </w:rPr>
-              <w:t>Arrancar el piloto (24-nov) y monitorear</w:t>
+              <w:t>Arrancar la validación del diseño en operación experimental controlada (24-nov) y monitorear</w:t>
             </w:r>
           </w:p>
         </w:tc>
@@ -10618,7 +10618,7 @@
               <w:rPr>
                 <w:sz w:val="19"/>
               </w:rPr>
-              <w:t>S7-03 piloto</w:t>
+              <w:t>S7-03 validación del diseño en operación experimental controlada</w:t>
             </w:r>
           </w:p>
         </w:tc>
@@ -10663,7 +10663,7 @@
               <w:rPr>
                 <w:sz w:val="19"/>
               </w:rPr>
-              <w:t>S7-03 piloto (24-nov → 5-dic)</w:t>
+              <w:t>S7-03 validación del diseño en operación experimental controlada (24-nov → 5-dic)</w:t>
             </w:r>
           </w:p>
         </w:tc>
@@ -12686,7 +12686,7 @@
               <w:rPr>
                 <w:sz w:val="19"/>
               </w:rPr>
-              <w:t>Pocas solicitudes durante el piloto (33 clientes)</w:t>
+              <w:t>Pocas solicitudes durante la validación del diseño en operación experimental controlada (33 clientes)</w:t>
             </w:r>
           </w:p>
         </w:tc>
@@ -12949,7 +12949,7 @@
               <w:rPr>
                 <w:sz w:val="19"/>
               </w:rPr>
-              <w:t>PoC inestable antes del piloto</w:t>
+              <w:t>PoC inestable antes de la validación del diseño en operación experimental controlada</w:t>
             </w:r>
           </w:p>
         </w:tc>
@@ -13015,7 +13015,7 @@
               <w:rPr>
                 <w:sz w:val="19"/>
               </w:rPr>
-              <w:t>PoC en S5 con una semana de margen; casos de prueba antes del piloto</w:t>
+              <w:t>PoC en S5 con una semana de margen; casos de prueba antes de la validación del diseño en operación experimental controlada</w:t>
             </w:r>
           </w:p>
         </w:tc>
@@ -13872,7 +13872,7 @@
 
 <file path=word/comments.xml><?xml version="1.0" encoding="utf-8"?>
 <w:comments xmlns:a="http://schemas.openxmlformats.org/drawingml/2006/main" xmlns:pic="http://schemas.openxmlformats.org/drawingml/2006/picture" xmlns:r="http://schemas.openxmlformats.org/officeDocument/2006/relationships" xmlns:w="http://schemas.openxmlformats.org/wordprocessingml/2006/main" xmlns:wp="http://schemas.openxmlformats.org/drawingml/2006/wordprocessingDrawing" xmlns:mc="http://schemas.openxmlformats.org/markup-compatibility/2006" xmlns:a14="http://schemas.microsoft.com/office/drawing/2010/main" xmlns:w14="http://schemas.microsoft.com/office/word/2010/wordml" xmlns:wpc="http://schemas.microsoft.com/office/word/2010/wordprocessingCanvas">
-  <w:comment w:id="0" w:author="Claude" w:initials="CL" w:date="2026-10-12T01:01:46Z">
+  <w:comment w:id="0" w:author="Claude" w:initials="CL" w:date="2026-10-12T01:09:27Z">
     <w:p>
       <w:pPr>
         <w:pStyle w:val="CommentText"/>
@@ -13888,7 +13888,7 @@
       </w:r>
     </w:p>
   </w:comment>
-  <w:comment w:id="1" w:author="Claude" w:initials="CL" w:date="2026-10-12T01:01:46Z">
+  <w:comment w:id="1" w:author="Claude" w:initials="CL" w:date="2026-10-12T01:09:27Z">
     <w:p>
       <w:pPr>
         <w:pStyle w:val="CommentText"/>
@@ -13904,7 +13904,7 @@
       </w:r>
     </w:p>
   </w:comment>
-  <w:comment w:id="2" w:author="Claude" w:initials="CL" w:date="2026-10-12T01:01:46Z">
+  <w:comment w:id="2" w:author="Claude" w:initials="CL" w:date="2026-10-12T01:09:28Z">
     <w:p>
       <w:pPr>
         <w:pStyle w:val="CommentText"/>
@@ -13920,7 +13920,7 @@
       </w:r>
     </w:p>
   </w:comment>
-  <w:comment w:id="3" w:author="Claude" w:initials="CL" w:date="2026-10-12T01:01:46Z">
+  <w:comment w:id="3" w:author="Claude" w:initials="CL" w:date="2026-10-12T01:09:28Z">
     <w:p>
       <w:pPr>
         <w:pStyle w:val="CommentText"/>

</xml_diff>